<commit_message>
fix docx template for contract_paid_50_50_ru
</commit_message>
<xml_diff>
--- a/assets/templates/docx/cancel_appointment.docx
+++ b/assets/templates/docx/cancel_appointment.docx
@@ -79,7 +79,6 @@
           <w:lang w:val="en-US"/>
         </w:rPr>
       </w:pPr>
-      <w:proofErr w:type="spellStart"/>
       <w:r>
         <w:rPr>
           <w:sz w:val="24"/>
@@ -87,7 +86,6 @@
         </w:rPr>
         <w:t>Алсейтовой</w:t>
       </w:r>
-      <w:proofErr w:type="spellEnd"/>
       <w:r>
         <w:rPr>
           <w:sz w:val="24"/>
@@ -739,9 +737,9 @@
         <w:tblLook w:val="04A0" w:firstRow="1" w:lastRow="0" w:firstColumn="1" w:lastColumn="0" w:noHBand="0" w:noVBand="1"/>
       </w:tblPr>
       <w:tblGrid>
-        <w:gridCol w:w="3269"/>
-        <w:gridCol w:w="4734"/>
-        <w:gridCol w:w="2013"/>
+        <w:gridCol w:w="3273"/>
+        <w:gridCol w:w="4720"/>
+        <w:gridCol w:w="2023"/>
       </w:tblGrid>
       <w:tr>
         <w:tc>
@@ -832,7 +830,7 @@
                 <w:sz w:val="24"/>
                 <w:szCs w:val="24"/>
               </w:rPr>
-              <w:t>({{CLIENT_FIO_SHORT}})</w:t>
+              <w:t>{{CLIENT_FIO_SHORT}}</w:t>
             </w:r>
           </w:p>
         </w:tc>
@@ -943,7 +941,7 @@
           </mc:Choice>
           <mc:Fallback>
             <w:pict>
-              <v:line w14:anchorId="2B427BA7" id="Линия 7" o:spid="_x0000_s1026" style="position:absolute;flip:y;z-index:251659264;visibility:visible;mso-wrap-style:square;mso-wrap-distance-left:9pt;mso-wrap-distance-top:0;mso-wrap-distance-right:9pt;mso-wrap-distance-bottom:0;mso-position-horizontal:absolute;mso-position-horizontal-relative:text;mso-position-vertical:absolute;mso-position-vertical-relative:text" from="5.7pt,1.95pt" to="518.45pt,2.45pt" o:gfxdata="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" strokeweight="3pt">
+              <v:line w14:anchorId="0D6EC213" id="Линия 7" o:spid="_x0000_s1026" style="position:absolute;flip:y;z-index:251659264;visibility:visible;mso-wrap-style:square;mso-wrap-distance-left:9pt;mso-wrap-distance-top:0;mso-wrap-distance-right:9pt;mso-wrap-distance-bottom:0;mso-position-horizontal:absolute;mso-position-horizontal-relative:text;mso-position-vertical:absolute;mso-position-vertical-relative:text" from="5.7pt,1.95pt" to="518.45pt,2.45pt" o:gfxdata="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" strokeweight="3pt">
                 <v:stroke dashstyle="dash" linestyle="thinThin"/>
               </v:line>
             </w:pict>
@@ -1004,7 +1002,7 @@
     </w:p>
     <w:p>
       <w:pPr>
-        <w:pStyle w:val="a5"/>
+        <w:pStyle w:val="NoSpacing"/>
         <w:jc w:val="both"/>
         <w:rPr>
           <w:rFonts w:ascii="Times New Roman" w:hAnsi="Times New Roman" w:cs="Times New Roman"/>
@@ -1016,7 +1014,7 @@
     </w:p>
     <w:p>
       <w:pPr>
-        <w:pStyle w:val="a5"/>
+        <w:pStyle w:val="NoSpacing"/>
         <w:ind w:firstLine="708"/>
         <w:jc w:val="both"/>
         <w:rPr>
@@ -1032,9 +1030,8 @@
           <w:szCs w:val="24"/>
           <w:lang w:val="ru-RU"/>
         </w:rPr>
-        <w:t xml:space="preserve">Операционный </w:t>
-      </w:r>
-      <w:proofErr w:type="gramStart"/>
+        <w:t xml:space="preserve">Операционный директор: </w:t>
+      </w:r>
       <w:r>
         <w:rPr>
           <w:rFonts w:ascii="Times New Roman" w:hAnsi="Times New Roman" w:cs="Times New Roman"/>
@@ -1042,7 +1039,7 @@
           <w:szCs w:val="24"/>
           <w:lang w:val="ru-RU"/>
         </w:rPr>
-        <w:t xml:space="preserve">директор: </w:t>
+        <w:t xml:space="preserve"> </w:t>
       </w:r>
       <w:r>
         <w:rPr>
@@ -1051,28 +1048,7 @@
           <w:szCs w:val="24"/>
           <w:lang w:val="ru-RU"/>
         </w:rPr>
-        <w:t xml:space="preserve"> </w:t>
-      </w:r>
-      <w:proofErr w:type="spellStart"/>
-      <w:r>
-        <w:rPr>
-          <w:rFonts w:ascii="Times New Roman" w:hAnsi="Times New Roman" w:cs="Times New Roman"/>
-          <w:sz w:val="24"/>
-          <w:szCs w:val="24"/>
-          <w:lang w:val="ru-RU"/>
-        </w:rPr>
-        <w:t>Алсейтова</w:t>
-      </w:r>
-      <w:proofErr w:type="spellEnd"/>
-      <w:proofErr w:type="gramEnd"/>
-      <w:r>
-        <w:rPr>
-          <w:rFonts w:ascii="Times New Roman" w:hAnsi="Times New Roman" w:cs="Times New Roman"/>
-          <w:sz w:val="24"/>
-          <w:szCs w:val="24"/>
-          <w:lang w:val="ru-RU"/>
-        </w:rPr>
-        <w:t xml:space="preserve"> К.Н.</w:t>
+        <w:t>Алсейтова К.Н.</w:t>
       </w:r>
       <w:r>
         <w:rPr>
@@ -1562,7 +1538,7 @@
     <w:lsdException w:name="Unresolved Mention" w:semiHidden="1" w:unhideWhenUsed="1"/>
     <w:lsdException w:name="Smart Link" w:semiHidden="1" w:unhideWhenUsed="1"/>
   </w:latentStyles>
-  <w:style w:type="paragraph" w:default="1" w:styleId="a">
+  <w:style w:type="paragraph" w:default="1" w:styleId="Normal">
     <w:name w:val="Normal"/>
     <w:qFormat/>
     <w:pPr>
@@ -1575,10 +1551,10 @@
       <w:lang w:val="ru-RU" w:eastAsia="en-US"/>
     </w:rPr>
   </w:style>
-  <w:style w:type="paragraph" w:styleId="1">
+  <w:style w:type="paragraph" w:styleId="Heading1">
     <w:name w:val="heading 1"/>
-    <w:basedOn w:val="a"/>
-    <w:next w:val="a"/>
+    <w:basedOn w:val="Normal"/>
+    <w:next w:val="Normal"/>
     <w:uiPriority w:val="9"/>
     <w:qFormat/>
     <w:pPr>
@@ -1595,9 +1571,9 @@
       <w:szCs w:val="32"/>
     </w:rPr>
   </w:style>
-  <w:style w:type="paragraph" w:styleId="3">
+  <w:style w:type="paragraph" w:styleId="Heading3">
     <w:name w:val="heading 3"/>
-    <w:next w:val="a"/>
+    <w:next w:val="Normal"/>
     <w:uiPriority w:val="9"/>
     <w:semiHidden/>
     <w:unhideWhenUsed/>
@@ -1615,13 +1591,13 @@
       <w:lang w:val="en-US" w:eastAsia="zh-CN"/>
     </w:rPr>
   </w:style>
-  <w:style w:type="character" w:default="1" w:styleId="a0">
+  <w:style w:type="character" w:default="1" w:styleId="DefaultParagraphFont">
     <w:name w:val="Default Paragraph Font"/>
     <w:uiPriority w:val="1"/>
     <w:semiHidden/>
     <w:unhideWhenUsed/>
   </w:style>
-  <w:style w:type="table" w:default="1" w:styleId="a1">
+  <w:style w:type="table" w:default="1" w:styleId="TableNormal">
     <w:name w:val="Normal Table"/>
     <w:uiPriority w:val="99"/>
     <w:semiHidden/>
@@ -1636,15 +1612,15 @@
       </w:tblCellMar>
     </w:tblPr>
   </w:style>
-  <w:style w:type="numbering" w:default="1" w:styleId="a2">
+  <w:style w:type="numbering" w:default="1" w:styleId="NoList">
     <w:name w:val="No List"/>
     <w:uiPriority w:val="99"/>
     <w:semiHidden/>
     <w:unhideWhenUsed/>
   </w:style>
-  <w:style w:type="character" w:styleId="a3">
+  <w:style w:type="character" w:styleId="Strong">
     <w:name w:val="Strong"/>
-    <w:basedOn w:val="a0"/>
+    <w:basedOn w:val="DefaultParagraphFont"/>
     <w:uiPriority w:val="22"/>
     <w:qFormat/>
     <w:rPr>
@@ -1652,7 +1628,7 @@
       <w:bCs/>
     </w:rPr>
   </w:style>
-  <w:style w:type="paragraph" w:styleId="a4">
+  <w:style w:type="paragraph" w:styleId="NormalWeb">
     <w:name w:val="Normal (Web)"/>
     <w:uiPriority w:val="99"/>
     <w:semiHidden/>
@@ -1667,7 +1643,7 @@
       <w:lang w:val="en-US" w:eastAsia="zh-CN"/>
     </w:rPr>
   </w:style>
-  <w:style w:type="paragraph" w:styleId="a5">
+  <w:style w:type="paragraph" w:styleId="NoSpacing">
     <w:name w:val="No Spacing"/>
     <w:uiPriority w:val="1"/>
     <w:qFormat/>

</xml_diff>